<commit_message>
fix: atende requisição direta do favicon
</commit_message>
<xml_diff>
--- a/docs/entrega/Documentacao_Projeto_Doce_Encanto.docx
+++ b/docs/entrega/Documentacao_Projeto_Doce_Encanto.docx
@@ -7251,7 +7251,7 @@
         <w:jc w:val="both"/>
       </w:pPr>
       <w:r>
-        <w:t>A suíte automatizada executou 15 testes em modelos, formulários, autenticação, carrinho, totais, checkout transacional, permissões, página inicial e seed. Resultado final: 15 aprovados, zero falhas e 87% de cobertura total. O comando de verificação do Django não apontou problemas. O workflow do GitHub repete python manage.py test a cada push e pull request.</w:t>
+        <w:t>A suíte automatizada executou 16 testes em modelos, formulários, autenticação, carrinho, totais, checkout transacional, permissões, página inicial, favicon e seed. Resultado final: 16 aprovados, zero falhas e 87% de cobertura total. O comando de verificação do Django não apontou problemas. O workflow do GitHub repete python manage.py test a cada push e pull request.</w:t>
       </w:r>
     </w:p>
     <w:p>
@@ -9231,7 +9231,7 @@
                 <w:color w:val="3A2428"/>
                 <w:sz w:val="17"/>
               </w:rPr>
-              <w:t>Exibir 15 testes, 87% de cobertura e pipeline do GitHub.</w:t>
+              <w:t>Exibir 16 testes, 87% de cobertura e pipeline do GitHub.</w:t>
             </w:r>
           </w:p>
         </w:tc>

</xml_diff>